<commit_message>
template changes and transaction history negative bug fixed
</commit_message>
<xml_diff>
--- a/server/templates/Sample_Palamboon.docx
+++ b/server/templates/Sample_Palamboon.docx
@@ -177,7 +177,21 @@
               <w:rPr>
                 <w:lang w:val="en-US"/>
               </w:rPr>
-              <w:t>{idNumber}</w:t>
+              <w:t>{</w:t>
+            </w:r>
+            <w:proofErr w:type="spellStart"/>
+            <w:r>
+              <w:rPr>
+                <w:lang w:val="en-US"/>
+              </w:rPr>
+              <w:t>idNumber</w:t>
+            </w:r>
+            <w:proofErr w:type="spellEnd"/>
+            <w:r>
+              <w:rPr>
+                <w:lang w:val="en-US"/>
+              </w:rPr>
+              <w:t>}</w:t>
             </w:r>
           </w:p>
         </w:tc>
@@ -451,7 +465,21 @@
               <w:rPr>
                 <w:lang w:val="en-US"/>
               </w:rPr>
-              <w:t>{residentialAddress}</w:t>
+              <w:t>{</w:t>
+            </w:r>
+            <w:proofErr w:type="spellStart"/>
+            <w:r>
+              <w:rPr>
+                <w:lang w:val="en-US"/>
+              </w:rPr>
+              <w:t>residentialAddress</w:t>
+            </w:r>
+            <w:proofErr w:type="spellEnd"/>
+            <w:r>
+              <w:rPr>
+                <w:lang w:val="en-US"/>
+              </w:rPr>
+              <w:t>}</w:t>
             </w:r>
           </w:p>
         </w:tc>
@@ -684,7 +712,25 @@
                 <w:iCs/>
                 <w:lang w:val="en-US"/>
               </w:rPr>
-              <w:t>{farmAddress}</w:t>
+              <w:t>{</w:t>
+            </w:r>
+            <w:proofErr w:type="spellStart"/>
+            <w:r>
+              <w:rPr>
+                <w:i/>
+                <w:iCs/>
+                <w:lang w:val="en-US"/>
+              </w:rPr>
+              <w:t>farmAddress</w:t>
+            </w:r>
+            <w:proofErr w:type="spellEnd"/>
+            <w:r>
+              <w:rPr>
+                <w:i/>
+                <w:iCs/>
+                <w:lang w:val="en-US"/>
+              </w:rPr>
+              <w:t>}</w:t>
             </w:r>
           </w:p>
         </w:tc>
@@ -1037,7 +1083,21 @@
               <w:rPr>
                 <w:lang w:val="en-US"/>
               </w:rPr>
-              <w:t>{contactNumber}</w:t>
+              <w:t>{</w:t>
+            </w:r>
+            <w:proofErr w:type="spellStart"/>
+            <w:r>
+              <w:rPr>
+                <w:lang w:val="en-US"/>
+              </w:rPr>
+              <w:t>contactNumber</w:t>
+            </w:r>
+            <w:proofErr w:type="spellEnd"/>
+            <w:r>
+              <w:rPr>
+                <w:lang w:val="en-US"/>
+              </w:rPr>
+              <w:t>}</w:t>
             </w:r>
           </w:p>
         </w:tc>
@@ -1104,7 +1164,21 @@
               <w:rPr>
                 <w:lang w:val="en-US"/>
               </w:rPr>
-              <w:t>{emailAddress}</w:t>
+              <w:t>{</w:t>
+            </w:r>
+            <w:proofErr w:type="spellStart"/>
+            <w:r>
+              <w:rPr>
+                <w:lang w:val="en-US"/>
+              </w:rPr>
+              <w:t>emailAddress</w:t>
+            </w:r>
+            <w:proofErr w:type="spellEnd"/>
+            <w:r>
+              <w:rPr>
+                <w:lang w:val="en-US"/>
+              </w:rPr>
+              <w:t>}</w:t>
             </w:r>
           </w:p>
         </w:tc>
@@ -1224,7 +1298,21 @@
               <w:rPr>
                 <w:lang w:val="en-US"/>
               </w:rPr>
-              <w:t>{deliveryDT}</w:t>
+              <w:t>{</w:t>
+            </w:r>
+            <w:proofErr w:type="spellStart"/>
+            <w:r>
+              <w:rPr>
+                <w:lang w:val="en-US"/>
+              </w:rPr>
+              <w:t>deliveryDT</w:t>
+            </w:r>
+            <w:proofErr w:type="spellEnd"/>
+            <w:r>
+              <w:rPr>
+                <w:lang w:val="en-US"/>
+              </w:rPr>
+              <w:t>}</w:t>
             </w:r>
           </w:p>
         </w:tc>
@@ -1668,7 +1756,21 @@
               <w:rPr>
                 <w:lang w:val="en-US"/>
               </w:rPr>
-              <w:t>{beanOrigin}</w:t>
+              <w:t>{</w:t>
+            </w:r>
+            <w:proofErr w:type="spellStart"/>
+            <w:r>
+              <w:rPr>
+                <w:lang w:val="en-US"/>
+              </w:rPr>
+              <w:t>beanOrigin</w:t>
+            </w:r>
+            <w:proofErr w:type="spellEnd"/>
+            <w:r>
+              <w:rPr>
+                <w:lang w:val="en-US"/>
+              </w:rPr>
+              <w:t>}</w:t>
             </w:r>
           </w:p>
         </w:tc>
@@ -1736,7 +1838,21 @@
               <w:rPr>
                 <w:lang w:val="en-US"/>
               </w:rPr>
-              <w:t>{beanAltitude}</w:t>
+              <w:t>{</w:t>
+            </w:r>
+            <w:proofErr w:type="spellStart"/>
+            <w:r>
+              <w:rPr>
+                <w:lang w:val="en-US"/>
+              </w:rPr>
+              <w:t>beanAltitude</w:t>
+            </w:r>
+            <w:proofErr w:type="spellEnd"/>
+            <w:r>
+              <w:rPr>
+                <w:lang w:val="en-US"/>
+              </w:rPr>
+              <w:t>}</w:t>
             </w:r>
           </w:p>
         </w:tc>
@@ -1899,7 +2015,25 @@
                 <w:szCs w:val="18"/>
                 <w:lang w:val="en-US"/>
               </w:rPr>
-              <w:t>(Php.)</w:t>
+              <w:t>(</w:t>
+            </w:r>
+            <w:proofErr w:type="spellStart"/>
+            <w:r>
+              <w:rPr>
+                <w:sz w:val="18"/>
+                <w:szCs w:val="18"/>
+                <w:lang w:val="en-US"/>
+              </w:rPr>
+              <w:t>Php</w:t>
+            </w:r>
+            <w:proofErr w:type="spellEnd"/>
+            <w:r>
+              <w:rPr>
+                <w:sz w:val="18"/>
+                <w:szCs w:val="18"/>
+                <w:lang w:val="en-US"/>
+              </w:rPr>
+              <w:t>.)</w:t>
             </w:r>
             <w:r>
               <w:rPr>
@@ -1987,7 +2121,21 @@
               <w:rPr>
                 <w:lang w:val="en-US"/>
               </w:rPr>
-              <w:t>{#rows}{unitCost}</w:t>
+              <w:t>{#</w:t>
+            </w:r>
+            <w:proofErr w:type="gramStart"/>
+            <w:r>
+              <w:rPr>
+                <w:lang w:val="en-US"/>
+              </w:rPr>
+              <w:t>rows}{</w:t>
+            </w:r>
+            <w:proofErr w:type="gramEnd"/>
+            <w:r>
+              <w:rPr>
+                <w:lang w:val="en-US"/>
+              </w:rPr>
+              <w:t>unitCost}</w:t>
             </w:r>
           </w:p>
         </w:tc>
@@ -2031,7 +2179,21 @@
               <w:rPr>
                 <w:lang w:val="en-US"/>
               </w:rPr>
-              <w:t>{totalPayable}</w:t>
+              <w:t>{</w:t>
+            </w:r>
+            <w:proofErr w:type="spellStart"/>
+            <w:r>
+              <w:rPr>
+                <w:lang w:val="en-US"/>
+              </w:rPr>
+              <w:t>totalPayable</w:t>
+            </w:r>
+            <w:proofErr w:type="spellEnd"/>
+            <w:r>
+              <w:rPr>
+                <w:lang w:val="en-US"/>
+              </w:rPr>
+              <w:t>}</w:t>
             </w:r>
           </w:p>
         </w:tc>
@@ -2049,7 +2211,21 @@
               <w:rPr>
                 <w:lang w:val="en-US"/>
               </w:rPr>
-              <w:t>{paymentDT}</w:t>
+              <w:t>{</w:t>
+            </w:r>
+            <w:proofErr w:type="spellStart"/>
+            <w:r>
+              <w:rPr>
+                <w:lang w:val="en-US"/>
+              </w:rPr>
+              <w:t>paymentDT</w:t>
+            </w:r>
+            <w:proofErr w:type="spellEnd"/>
+            <w:r>
+              <w:rPr>
+                <w:lang w:val="en-US"/>
+              </w:rPr>
+              <w:t>}</w:t>
             </w:r>
           </w:p>
         </w:tc>
@@ -2067,13 +2243,27 @@
               <w:rPr>
                 <w:lang w:val="en-US"/>
               </w:rPr>
-              <w:t>{remarks2}</w:t>
-            </w:r>
-            <w:r>
-              <w:rPr>
-                <w:lang w:val="en-US"/>
-              </w:rPr>
-              <w:t>{/rows}</w:t>
+              <w:t>{remarks</w:t>
+            </w:r>
+            <w:proofErr w:type="gramStart"/>
+            <w:r>
+              <w:rPr>
+                <w:lang w:val="en-US"/>
+              </w:rPr>
+              <w:t>2}</w:t>
+            </w:r>
+            <w:r>
+              <w:rPr>
+                <w:lang w:val="en-US"/>
+              </w:rPr>
+              <w:t>{</w:t>
+            </w:r>
+            <w:proofErr w:type="gramEnd"/>
+            <w:r>
+              <w:rPr>
+                <w:lang w:val="en-US"/>
+              </w:rPr>
+              <w:t>/rows}</w:t>
             </w:r>
           </w:p>
         </w:tc>
@@ -2157,7 +2347,23 @@
                 <w:iCs/>
                 <w:lang w:val="en-US"/>
               </w:rPr>
-              <w:t>{senderName}</w:t>
+              <w:t>{</w:t>
+            </w:r>
+            <w:r>
+              <w:rPr>
+                <w:i/>
+                <w:iCs/>
+                <w:lang w:val="en-US"/>
+              </w:rPr>
+              <w:t>name</w:t>
+            </w:r>
+            <w:r>
+              <w:rPr>
+                <w:i/>
+                <w:iCs/>
+                <w:lang w:val="en-US"/>
+              </w:rPr>
+              <w:t>}</w:t>
             </w:r>
           </w:p>
           <w:p>
@@ -2203,7 +2409,25 @@
                 <w:iCs/>
                 <w:lang w:val="en-US"/>
               </w:rPr>
-              <w:t>{receiverName}</w:t>
+              <w:t>{</w:t>
+            </w:r>
+            <w:proofErr w:type="spellStart"/>
+            <w:r>
+              <w:rPr>
+                <w:i/>
+                <w:iCs/>
+                <w:lang w:val="en-US"/>
+              </w:rPr>
+              <w:t>receiverName</w:t>
+            </w:r>
+            <w:proofErr w:type="spellEnd"/>
+            <w:r>
+              <w:rPr>
+                <w:i/>
+                <w:iCs/>
+                <w:lang w:val="en-US"/>
+              </w:rPr>
+              <w:t>}</w:t>
             </w:r>
           </w:p>
           <w:p>
@@ -2468,7 +2692,21 @@
               <w:rPr>
                 <w:lang w:val="en-US"/>
               </w:rPr>
-              <w:t>{idNumber}</w:t>
+              <w:t>{</w:t>
+            </w:r>
+            <w:proofErr w:type="spellStart"/>
+            <w:r>
+              <w:rPr>
+                <w:lang w:val="en-US"/>
+              </w:rPr>
+              <w:t>idNumber</w:t>
+            </w:r>
+            <w:proofErr w:type="spellEnd"/>
+            <w:r>
+              <w:rPr>
+                <w:lang w:val="en-US"/>
+              </w:rPr>
+              <w:t>}</w:t>
             </w:r>
           </w:p>
         </w:tc>
@@ -2737,7 +2975,21 @@
               <w:rPr>
                 <w:lang w:val="en-US"/>
               </w:rPr>
-              <w:t>{contactNumber}</w:t>
+              <w:t>{</w:t>
+            </w:r>
+            <w:proofErr w:type="spellStart"/>
+            <w:r>
+              <w:rPr>
+                <w:lang w:val="en-US"/>
+              </w:rPr>
+              <w:t>contactNumber</w:t>
+            </w:r>
+            <w:proofErr w:type="spellEnd"/>
+            <w:r>
+              <w:rPr>
+                <w:lang w:val="en-US"/>
+              </w:rPr>
+              <w:t>}</w:t>
             </w:r>
           </w:p>
         </w:tc>
@@ -2804,7 +3056,21 @@
               <w:rPr>
                 <w:lang w:val="en-US"/>
               </w:rPr>
-              <w:t>{emailAddress}</w:t>
+              <w:t>{</w:t>
+            </w:r>
+            <w:proofErr w:type="spellStart"/>
+            <w:r>
+              <w:rPr>
+                <w:lang w:val="en-US"/>
+              </w:rPr>
+              <w:t>emailAddress</w:t>
+            </w:r>
+            <w:proofErr w:type="spellEnd"/>
+            <w:r>
+              <w:rPr>
+                <w:lang w:val="en-US"/>
+              </w:rPr>
+              <w:t>}</w:t>
             </w:r>
           </w:p>
         </w:tc>
@@ -3023,8 +3289,20 @@
                 <w:szCs w:val="16"/>
                 <w:lang w:val="en-US"/>
               </w:rPr>
-              <w:t>Date and Time</w:t>
-            </w:r>
+              <w:t xml:space="preserve">Date and </w:t>
+            </w:r>
+            <w:proofErr w:type="gramStart"/>
+            <w:r>
+              <w:rPr>
+                <w:i/>
+                <w:iCs/>
+                <w:sz w:val="16"/>
+                <w:szCs w:val="16"/>
+                <w:lang w:val="en-US"/>
+              </w:rPr>
+              <w:t>Time</w:t>
+            </w:r>
+            <w:proofErr w:type="gramEnd"/>
           </w:p>
         </w:tc>
       </w:tr>
@@ -3043,7 +3321,21 @@
               <w:rPr>
                 <w:lang w:val="en-US"/>
               </w:rPr>
-              <w:t>{#rows}{arNo}</w:t>
+              <w:t>{#</w:t>
+            </w:r>
+            <w:proofErr w:type="gramStart"/>
+            <w:r>
+              <w:rPr>
+                <w:lang w:val="en-US"/>
+              </w:rPr>
+              <w:t>rows}{</w:t>
+            </w:r>
+            <w:proofErr w:type="gramEnd"/>
+            <w:r>
+              <w:rPr>
+                <w:lang w:val="en-US"/>
+              </w:rPr>
+              <w:t>arNo}</w:t>
             </w:r>
           </w:p>
         </w:tc>
@@ -3079,7 +3371,21 @@
               <w:rPr>
                 <w:lang w:val="en-US"/>
               </w:rPr>
-              <w:t>{unitCost}</w:t>
+              <w:t>{</w:t>
+            </w:r>
+            <w:proofErr w:type="spellStart"/>
+            <w:r>
+              <w:rPr>
+                <w:lang w:val="en-US"/>
+              </w:rPr>
+              <w:t>unitCost</w:t>
+            </w:r>
+            <w:proofErr w:type="spellEnd"/>
+            <w:r>
+              <w:rPr>
+                <w:lang w:val="en-US"/>
+              </w:rPr>
+              <w:t>}</w:t>
             </w:r>
           </w:p>
         </w:tc>
@@ -3116,7 +3422,21 @@
               <w:rPr>
                 <w:lang w:val="en-US"/>
               </w:rPr>
-              <w:t>{totalAmount}</w:t>
+              <w:t>{</w:t>
+            </w:r>
+            <w:proofErr w:type="spellStart"/>
+            <w:r>
+              <w:rPr>
+                <w:lang w:val="en-US"/>
+              </w:rPr>
+              <w:t>totalAmount</w:t>
+            </w:r>
+            <w:proofErr w:type="spellEnd"/>
+            <w:r>
+              <w:rPr>
+                <w:lang w:val="en-US"/>
+              </w:rPr>
+              <w:t>}</w:t>
             </w:r>
           </w:p>
         </w:tc>
@@ -3130,11 +3450,33 @@
                 <w:lang w:val="en-US"/>
               </w:rPr>
             </w:pPr>
-            <w:r>
-              <w:rPr>
-                <w:lang w:val="en-US"/>
-              </w:rPr>
-              <w:t>{paymentDT}{/rows}</w:t>
+            <w:proofErr w:type="gramStart"/>
+            <w:r>
+              <w:rPr>
+                <w:lang w:val="en-US"/>
+              </w:rPr>
+              <w:t>{</w:t>
+            </w:r>
+            <w:proofErr w:type="spellStart"/>
+            <w:r>
+              <w:rPr>
+                <w:lang w:val="en-US"/>
+              </w:rPr>
+              <w:t>paymentDT</w:t>
+            </w:r>
+            <w:proofErr w:type="spellEnd"/>
+            <w:r>
+              <w:rPr>
+                <w:lang w:val="en-US"/>
+              </w:rPr>
+              <w:t>}{/</w:t>
+            </w:r>
+            <w:proofErr w:type="gramEnd"/>
+            <w:r>
+              <w:rPr>
+                <w:lang w:val="en-US"/>
+              </w:rPr>
+              <w:t>rows}</w:t>
             </w:r>
           </w:p>
         </w:tc>
@@ -3159,13 +3501,35 @@
               <w:rPr>
                 <w:lang w:val="en-US"/>
               </w:rPr>
-              <w:t>Amount in figures:</w:t>
-            </w:r>
-            <w:r>
-              <w:rPr>
-                <w:lang w:val="en-US"/>
-              </w:rPr>
-              <w:t xml:space="preserve"> {amountInFigures}</w:t>
+              <w:t xml:space="preserve">Amount in </w:t>
+            </w:r>
+            <w:proofErr w:type="gramStart"/>
+            <w:r>
+              <w:rPr>
+                <w:lang w:val="en-US"/>
+              </w:rPr>
+              <w:t>figures:</w:t>
+            </w:r>
+            <w:r>
+              <w:rPr>
+                <w:lang w:val="en-US"/>
+              </w:rPr>
+              <w:t xml:space="preserve"> {</w:t>
+            </w:r>
+            <w:proofErr w:type="spellStart"/>
+            <w:proofErr w:type="gramEnd"/>
+            <w:r>
+              <w:rPr>
+                <w:lang w:val="en-US"/>
+              </w:rPr>
+              <w:t>amountInFigures</w:t>
+            </w:r>
+            <w:proofErr w:type="spellEnd"/>
+            <w:r>
+              <w:rPr>
+                <w:lang w:val="en-US"/>
+              </w:rPr>
+              <w:t>}</w:t>
             </w:r>
           </w:p>
         </w:tc>
@@ -3190,13 +3554,35 @@
               <w:rPr>
                 <w:lang w:val="en-US"/>
               </w:rPr>
-              <w:t>Amount in words:</w:t>
-            </w:r>
-            <w:r>
-              <w:rPr>
-                <w:lang w:val="en-US"/>
-              </w:rPr>
-              <w:t xml:space="preserve"> {amountInWords}</w:t>
+              <w:t xml:space="preserve">Amount in </w:t>
+            </w:r>
+            <w:proofErr w:type="gramStart"/>
+            <w:r>
+              <w:rPr>
+                <w:lang w:val="en-US"/>
+              </w:rPr>
+              <w:t>words:</w:t>
+            </w:r>
+            <w:r>
+              <w:rPr>
+                <w:lang w:val="en-US"/>
+              </w:rPr>
+              <w:t xml:space="preserve"> {</w:t>
+            </w:r>
+            <w:proofErr w:type="spellStart"/>
+            <w:proofErr w:type="gramEnd"/>
+            <w:r>
+              <w:rPr>
+                <w:lang w:val="en-US"/>
+              </w:rPr>
+              <w:t>amountInWords</w:t>
+            </w:r>
+            <w:proofErr w:type="spellEnd"/>
+            <w:r>
+              <w:rPr>
+                <w:lang w:val="en-US"/>
+              </w:rPr>
+              <w:t>}</w:t>
             </w:r>
           </w:p>
         </w:tc>
@@ -3280,7 +3666,25 @@
                 <w:iCs/>
                 <w:lang w:val="en-US"/>
               </w:rPr>
-              <w:t>{payeeName}</w:t>
+              <w:t>{</w:t>
+            </w:r>
+            <w:proofErr w:type="spellStart"/>
+            <w:r>
+              <w:rPr>
+                <w:i/>
+                <w:iCs/>
+                <w:lang w:val="en-US"/>
+              </w:rPr>
+              <w:t>payeeName</w:t>
+            </w:r>
+            <w:proofErr w:type="spellEnd"/>
+            <w:r>
+              <w:rPr>
+                <w:i/>
+                <w:iCs/>
+                <w:lang w:val="en-US"/>
+              </w:rPr>
+              <w:t>}</w:t>
             </w:r>
           </w:p>
           <w:p>
@@ -3326,7 +3730,25 @@
                 <w:iCs/>
                 <w:lang w:val="en-US"/>
               </w:rPr>
-              <w:t>{payorName}</w:t>
+              <w:t>{</w:t>
+            </w:r>
+            <w:proofErr w:type="spellStart"/>
+            <w:r>
+              <w:rPr>
+                <w:i/>
+                <w:iCs/>
+                <w:lang w:val="en-US"/>
+              </w:rPr>
+              <w:t>payorName</w:t>
+            </w:r>
+            <w:proofErr w:type="spellEnd"/>
+            <w:r>
+              <w:rPr>
+                <w:i/>
+                <w:iCs/>
+                <w:lang w:val="en-US"/>
+              </w:rPr>
+              <w:t>}</w:t>
             </w:r>
           </w:p>
           <w:p>
@@ -3495,6 +3917,7 @@
         <w:lang w:val="en-US"/>
       </w:rPr>
     </w:pPr>
+    <w:proofErr w:type="spellStart"/>
     <w:r>
       <w:rPr>
         <w:i/>
@@ -3503,7 +3926,40 @@
         <w:szCs w:val="14"/>
         <w:lang w:val="en-US"/>
       </w:rPr>
-      <w:t>Kaatuan, Lantapan, Bukidnon</w:t>
+      <w:t>Kaatuan</w:t>
+    </w:r>
+    <w:proofErr w:type="spellEnd"/>
+    <w:r>
+      <w:rPr>
+        <w:i/>
+        <w:iCs/>
+        <w:sz w:val="14"/>
+        <w:szCs w:val="14"/>
+        <w:lang w:val="en-US"/>
+      </w:rPr>
+      <w:t xml:space="preserve">, </w:t>
+    </w:r>
+    <w:proofErr w:type="spellStart"/>
+    <w:r>
+      <w:rPr>
+        <w:i/>
+        <w:iCs/>
+        <w:sz w:val="14"/>
+        <w:szCs w:val="14"/>
+        <w:lang w:val="en-US"/>
+      </w:rPr>
+      <w:t>Lantapan</w:t>
+    </w:r>
+    <w:proofErr w:type="spellEnd"/>
+    <w:r>
+      <w:rPr>
+        <w:i/>
+        <w:iCs/>
+        <w:sz w:val="14"/>
+        <w:szCs w:val="14"/>
+        <w:lang w:val="en-US"/>
+      </w:rPr>
+      <w:t>, Bukidnon</w:t>
     </w:r>
   </w:p>
 </w:hdr>

</xml_diff>